<commit_message>
Update application files and add configuration
</commit_message>
<xml_diff>
--- a/templates/CHAMBER_template.docx
+++ b/templates/CHAMBER_template.docx
@@ -61,8 +61,8 @@
         <w:gridCol w:w="3436"/>
         <w:gridCol w:w="1433"/>
         <w:gridCol w:w="1810"/>
-        <w:gridCol w:w="858"/>
-        <w:gridCol w:w="1885"/>
+        <w:gridCol w:w="1213"/>
+        <w:gridCol w:w="1530"/>
       </w:tblGrid>
       <w:tr>
         <w:trPr>
@@ -550,7 +550,7 @@
         </w:tc>
         <w:tc>
           <w:tcPr>
-            <w:tcW w:w="858" w:type="dxa"/>
+            <w:tcW w:w="1213" w:type="dxa"/>
           </w:tcPr>
           <w:p>
             <w:pPr>
@@ -563,7 +563,7 @@
         </w:tc>
         <w:tc>
           <w:tcPr>
-            <w:tcW w:w="1885" w:type="dxa"/>
+            <w:tcW w:w="1530" w:type="dxa"/>
           </w:tcPr>
           <w:p>
             <w:pPr>
@@ -875,7 +875,7 @@
         </w:tc>
         <w:tc>
           <w:tcPr>
-            <w:tcW w:w="858" w:type="dxa"/>
+            <w:tcW w:w="1213" w:type="dxa"/>
           </w:tcPr>
           <w:p>
             <w:pPr>
@@ -936,7 +936,7 @@
         </w:tc>
         <w:tc>
           <w:tcPr>
-            <w:tcW w:w="1885" w:type="dxa"/>
+            <w:tcW w:w="1530" w:type="dxa"/>
           </w:tcPr>
           <w:p>
             <w:pPr>
@@ -969,6 +969,13 @@
                 <w:szCs w:val="18"/>
               </w:rPr>
             </w:pPr>
+            <w:r>
+              <w:rPr>
+                <w:sz w:val="18"/>
+                <w:szCs w:val="18"/>
+              </w:rPr>
+              <w:t xml:space="preserve">     </w:t>
+            </w:r>
             <w:r>
               <w:rPr>
                 <w:sz w:val="12"/>

</xml_diff>

<commit_message>
chamber template style changed
</commit_message>
<xml_diff>
--- a/templates/CHAMBER_template.docx
+++ b/templates/CHAMBER_template.docx
@@ -61,8 +61,8 @@
         <w:gridCol w:w="3436"/>
         <w:gridCol w:w="1433"/>
         <w:gridCol w:w="1810"/>
-        <w:gridCol w:w="1213"/>
-        <w:gridCol w:w="1530"/>
+        <w:gridCol w:w="858"/>
+        <w:gridCol w:w="1885"/>
       </w:tblGrid>
       <w:tr>
         <w:trPr>
@@ -550,7 +550,7 @@
         </w:tc>
         <w:tc>
           <w:tcPr>
-            <w:tcW w:w="1213" w:type="dxa"/>
+            <w:tcW w:w="858" w:type="dxa"/>
           </w:tcPr>
           <w:p>
             <w:pPr>
@@ -563,7 +563,7 @@
         </w:tc>
         <w:tc>
           <w:tcPr>
-            <w:tcW w:w="1530" w:type="dxa"/>
+            <w:tcW w:w="1885" w:type="dxa"/>
           </w:tcPr>
           <w:p>
             <w:pPr>
@@ -698,7 +698,15 @@
           </w:p>
           <w:p>
             <w:r>
-              <w:t>Nepalese Handicraft Goods ,Cotton,wollen &amp;Personal goods</w:t>
+              <w:t>Nepalese Handicraft Goods ,</w:t>
+            </w:r>
+            <w:proofErr w:type="spellStart"/>
+            <w:r>
+              <w:t>Cotton,wollen</w:t>
+            </w:r>
+            <w:proofErr w:type="spellEnd"/>
+            <w:r>
+              <w:t xml:space="preserve"> &amp;Personal goods</w:t>
             </w:r>
           </w:p>
           <w:p/>
@@ -875,7 +883,7 @@
         </w:tc>
         <w:tc>
           <w:tcPr>
-            <w:tcW w:w="1213" w:type="dxa"/>
+            <w:tcW w:w="858" w:type="dxa"/>
           </w:tcPr>
           <w:p>
             <w:pPr>
@@ -936,7 +944,7 @@
         </w:tc>
         <w:tc>
           <w:tcPr>
-            <w:tcW w:w="1530" w:type="dxa"/>
+            <w:tcW w:w="1885" w:type="dxa"/>
           </w:tcPr>
           <w:p>
             <w:pPr>
@@ -969,13 +977,6 @@
                 <w:szCs w:val="18"/>
               </w:rPr>
             </w:pPr>
-            <w:r>
-              <w:rPr>
-                <w:sz w:val="18"/>
-                <w:szCs w:val="18"/>
-              </w:rPr>
-              <w:t xml:space="preserve">     </w:t>
-            </w:r>
             <w:r>
               <w:rPr>
                 <w:sz w:val="12"/>
@@ -1086,7 +1087,21 @@
                 <w:sz w:val="16"/>
                 <w:szCs w:val="16"/>
               </w:rPr>
-              <w:t xml:space="preserve">       </w:t>
+              <w:t xml:space="preserve">      </w:t>
+            </w:r>
+            <w:r>
+              <w:rPr>
+                <w:sz w:val="16"/>
+                <w:szCs w:val="16"/>
+              </w:rPr>
+              <w:t xml:space="preserve">     </w:t>
+            </w:r>
+            <w:r>
+              <w:rPr>
+                <w:sz w:val="16"/>
+                <w:szCs w:val="16"/>
+              </w:rPr>
+              <w:t xml:space="preserve"> </w:t>
             </w:r>
             <w:r>
               <w:rPr>

</xml_diff>